<commit_message>
update report for final table
</commit_message>
<xml_diff>
--- a/Final_Report/Report.docx
+++ b/Final_Report/Report.docx
@@ -1798,11 +1798,7 @@
       </w:r>
       <w:r>
         <w:rPr/>
-        <w:t>"test_accuracy": 0.7659%</w:t>
-      </w:r>
-      <w:r>
-        <w:rPr/>
-        <w:t>(100 epoch)</w:t>
+        <w:t>"test_accuracy": 0.7659%(100 epoch)</w:t>
       </w:r>
     </w:p>
     <w:p>
@@ -1816,11 +1812,7 @@
       </w:r>
       <w:r>
         <w:rPr/>
-        <w:t>"best_val_accuracy": 0.7628%</w:t>
-      </w:r>
-      <w:r>
-        <w:rPr/>
-        <w:t>(100 epoch)</w:t>
+        <w:t>"best_val_accuracy": 0.7628%(100 epoch)</w:t>
       </w:r>
     </w:p>
     <w:p>
@@ -2195,7 +2187,15 @@
         </w:rPr>
       </w:pPr>
       <w:r>
-        <w:rPr/>
+        <w:rPr>
+          <w:rFonts w:ascii="system-ui;Ubuntu;Droid Sans;sans-serif" w:hAnsi="system-ui;Ubuntu;Droid Sans;sans-serif"/>
+          <w:b w:val="false"/>
+          <w:i w:val="false"/>
+          <w:caps w:val="false"/>
+          <w:smallCaps w:val="false"/>
+          <w:spacing w:val="0"/>
+          <w:sz w:val="20"/>
+        </w:rPr>
       </w:r>
     </w:p>
     <w:tbl>
@@ -2213,7 +2213,7 @@
       </w:tblPr>
       <w:tblGrid>
         <w:gridCol w:w="4872"/>
-        <w:gridCol w:w="813"/>
+        <w:gridCol w:w="812"/>
       </w:tblGrid>
       <w:tr>
         <w:trPr>
@@ -2228,7 +2228,8 @@
           <w:p>
             <w:pPr>
               <w:pStyle w:val="TableHeading"/>
-              <w:spacing w:lineRule="auto" w:line="340" w:before="0" w:after="200"/>
+              <w:widowControl w:val="false"/>
+              <w:spacing w:lineRule="auto" w:line="338" w:before="0" w:after="200"/>
               <w:jc w:val="left"/>
               <w:rPr>
                 <w:sz w:val="21"/>
@@ -2244,14 +2245,15 @@
         </w:tc>
         <w:tc>
           <w:tcPr>
-            <w:tcW w:w="813" w:type="dxa"/>
+            <w:tcW w:w="812" w:type="dxa"/>
             <w:tcBorders/>
             <w:vAlign w:val="center"/>
           </w:tcPr>
           <w:p>
             <w:pPr>
               <w:pStyle w:val="TableHeading"/>
-              <w:spacing w:lineRule="auto" w:line="340" w:before="0" w:after="200"/>
+              <w:widowControl w:val="false"/>
+              <w:spacing w:lineRule="auto" w:line="338" w:before="0" w:after="200"/>
               <w:jc w:val="left"/>
               <w:rPr>
                 <w:sz w:val="21"/>
@@ -2284,6 +2286,7 @@
           <w:p>
             <w:pPr>
               <w:pStyle w:val="TableContents"/>
+              <w:widowControl w:val="false"/>
               <w:spacing w:before="0" w:after="0"/>
               <w:jc w:val="left"/>
               <w:rPr/>
@@ -2296,7 +2299,7 @@
         </w:tc>
         <w:tc>
           <w:tcPr>
-            <w:tcW w:w="813" w:type="dxa"/>
+            <w:tcW w:w="812" w:type="dxa"/>
             <w:tcBorders>
               <w:bottom w:val="single" w:sz="2" w:space="0" w:color="000000"/>
             </w:tcBorders>
@@ -2308,6 +2311,7 @@
           <w:p>
             <w:pPr>
               <w:pStyle w:val="TableContents"/>
+              <w:widowControl w:val="false"/>
               <w:spacing w:before="0" w:after="0"/>
               <w:jc w:val="left"/>
               <w:rPr/>
@@ -2335,6 +2339,7 @@
           <w:p>
             <w:pPr>
               <w:pStyle w:val="TableContents"/>
+              <w:widowControl w:val="false"/>
               <w:spacing w:before="0" w:after="0"/>
               <w:jc w:val="left"/>
               <w:rPr/>
@@ -2347,13 +2352,14 @@
         </w:tc>
         <w:tc>
           <w:tcPr>
-            <w:tcW w:w="813" w:type="dxa"/>
+            <w:tcW w:w="812" w:type="dxa"/>
             <w:tcBorders/>
             <w:vAlign w:val="center"/>
           </w:tcPr>
           <w:p>
             <w:pPr>
               <w:pStyle w:val="TableContents"/>
+              <w:widowControl w:val="false"/>
               <w:spacing w:before="0" w:after="0"/>
               <w:jc w:val="left"/>
               <w:rPr/>
@@ -2384,7 +2390,15 @@
         </w:rPr>
       </w:pPr>
       <w:r>
-        <w:rPr/>
+        <w:rPr>
+          <w:rFonts w:ascii="system-ui;Ubuntu;Droid Sans;sans-serif" w:hAnsi="system-ui;Ubuntu;Droid Sans;sans-serif"/>
+          <w:b w:val="false"/>
+          <w:i w:val="false"/>
+          <w:caps w:val="false"/>
+          <w:smallCaps w:val="false"/>
+          <w:spacing w:val="0"/>
+          <w:sz w:val="20"/>
+        </w:rPr>
       </w:r>
     </w:p>
     <w:p>
@@ -2838,7 +2852,7 @@
             <w:pPr>
               <w:pStyle w:val="TableHeading"/>
               <w:widowControl w:val="false"/>
-              <w:spacing w:lineRule="auto" w:line="338" w:before="0" w:after="200"/>
+              <w:spacing w:lineRule="auto" w:line="336" w:before="0" w:after="200"/>
               <w:jc w:val="left"/>
               <w:rPr>
                 <w:sz w:val="21"/>
@@ -2862,7 +2876,7 @@
             <w:pPr>
               <w:pStyle w:val="TableHeading"/>
               <w:widowControl w:val="false"/>
-              <w:spacing w:lineRule="auto" w:line="338" w:before="0" w:after="200"/>
+              <w:spacing w:lineRule="auto" w:line="336" w:before="0" w:after="200"/>
               <w:jc w:val="left"/>
               <w:rPr>
                 <w:sz w:val="21"/>
@@ -3221,7 +3235,7 @@
             <w:pPr>
               <w:pStyle w:val="TableHeading"/>
               <w:widowControl w:val="false"/>
-              <w:spacing w:lineRule="auto" w:line="338" w:before="0" w:after="200"/>
+              <w:spacing w:lineRule="auto" w:line="336" w:before="0" w:after="200"/>
               <w:jc w:val="left"/>
               <w:rPr>
                 <w:sz w:val="21"/>
@@ -3245,7 +3259,7 @@
             <w:pPr>
               <w:pStyle w:val="TableHeading"/>
               <w:widowControl w:val="false"/>
-              <w:spacing w:lineRule="auto" w:line="338" w:before="0" w:after="200"/>
+              <w:spacing w:lineRule="auto" w:line="336" w:before="0" w:after="200"/>
               <w:jc w:val="left"/>
               <w:rPr>
                 <w:sz w:val="21"/>
@@ -3752,7 +3766,7 @@
       </w:tblPr>
       <w:tblGrid>
         <w:gridCol w:w="3020"/>
-        <w:gridCol w:w="2917"/>
+        <w:gridCol w:w="2916"/>
       </w:tblGrid>
       <w:tr>
         <w:trPr>
@@ -3768,7 +3782,7 @@
             <w:pPr>
               <w:pStyle w:val="TableHeading"/>
               <w:widowControl w:val="false"/>
-              <w:spacing w:lineRule="auto" w:line="338" w:before="0" w:after="200"/>
+              <w:spacing w:lineRule="auto" w:line="336" w:before="0" w:after="200"/>
               <w:jc w:val="left"/>
               <w:rPr>
                 <w:sz w:val="21"/>
@@ -3784,7 +3798,7 @@
         </w:tc>
         <w:tc>
           <w:tcPr>
-            <w:tcW w:w="2917" w:type="dxa"/>
+            <w:tcW w:w="2916" w:type="dxa"/>
             <w:tcBorders/>
             <w:vAlign w:val="center"/>
           </w:tcPr>
@@ -3792,7 +3806,7 @@
             <w:pPr>
               <w:pStyle w:val="TableHeading"/>
               <w:widowControl w:val="false"/>
-              <w:spacing w:lineRule="auto" w:line="338" w:before="0" w:after="200"/>
+              <w:spacing w:lineRule="auto" w:line="336" w:before="0" w:after="200"/>
               <w:jc w:val="left"/>
               <w:rPr>
                 <w:sz w:val="21"/>
@@ -3838,7 +3852,7 @@
         </w:tc>
         <w:tc>
           <w:tcPr>
-            <w:tcW w:w="2917" w:type="dxa"/>
+            <w:tcW w:w="2916" w:type="dxa"/>
             <w:tcBorders>
               <w:bottom w:val="single" w:sz="2" w:space="0" w:color="000000"/>
             </w:tcBorders>
@@ -3891,7 +3905,7 @@
         </w:tc>
         <w:tc>
           <w:tcPr>
-            <w:tcW w:w="2917" w:type="dxa"/>
+            <w:tcW w:w="2916" w:type="dxa"/>
             <w:tcBorders/>
             <w:vAlign w:val="center"/>
           </w:tcPr>
@@ -4770,6 +4784,643 @@
       <w:r>
         <w:rPr/>
         <w:t>Limitations: only 10% labels, CIFAR-10 only, 50 SimCLR epochs, loss still ~6.4 (not fully converged), t-SNE is qualitative, compute time (~3 h pretrain alone).</w:t>
+      </w:r>
+    </w:p>
+    <w:p>
+      <w:pPr>
+        <w:pStyle w:val="TextBody"/>
+        <w:tabs>
+          <w:tab w:val="clear" w:pos="720"/>
+          <w:tab w:val="left" w:pos="0" w:leader="none"/>
+        </w:tabs>
+        <w:ind w:hanging="0"/>
+        <w:rPr/>
+      </w:pPr>
+      <w:r>
+        <w:rPr/>
+      </w:r>
+    </w:p>
+    <w:p>
+      <w:pPr>
+        <w:pStyle w:val="TextBody"/>
+        <w:tabs>
+          <w:tab w:val="clear" w:pos="720"/>
+          <w:tab w:val="left" w:pos="0" w:leader="none"/>
+        </w:tabs>
+        <w:ind w:hanging="0"/>
+        <w:rPr/>
+      </w:pPr>
+      <w:r>
+        <w:rPr/>
+      </w:r>
+    </w:p>
+    <w:p>
+      <w:pPr>
+        <w:pStyle w:val="TextBody"/>
+        <w:tabs>
+          <w:tab w:val="clear" w:pos="720"/>
+          <w:tab w:val="left" w:pos="0" w:leader="none"/>
+        </w:tabs>
+        <w:ind w:hanging="0"/>
+        <w:rPr/>
+      </w:pPr>
+      <w:r>
+        <w:rPr/>
+      </w:r>
+    </w:p>
+    <w:p>
+      <w:pPr>
+        <w:pStyle w:val="TextBody"/>
+        <w:tabs>
+          <w:tab w:val="clear" w:pos="720"/>
+          <w:tab w:val="left" w:pos="0" w:leader="none"/>
+        </w:tabs>
+        <w:ind w:hanging="0"/>
+        <w:rPr/>
+      </w:pPr>
+      <w:r>
+        <w:rPr/>
+      </w:r>
+    </w:p>
+    <w:p>
+      <w:pPr>
+        <w:pStyle w:val="TextBody"/>
+        <w:tabs>
+          <w:tab w:val="clear" w:pos="720"/>
+          <w:tab w:val="left" w:pos="0" w:leader="none"/>
+        </w:tabs>
+        <w:ind w:hanging="0"/>
+        <w:rPr/>
+      </w:pPr>
+      <w:r>
+        <w:rPr/>
+      </w:r>
+    </w:p>
+    <w:p>
+      <w:pPr>
+        <w:pStyle w:val="Heading1"/>
+        <w:tabs>
+          <w:tab w:val="clear" w:pos="720"/>
+          <w:tab w:val="left" w:pos="0" w:leader="none"/>
+        </w:tabs>
+        <w:ind w:hanging="0"/>
+        <w:rPr/>
+      </w:pPr>
+      <w:r>
+        <w:rPr/>
+        <w:t>1</w:t>
+      </w:r>
+      <w:r>
+        <w:rPr/>
+        <w:t>2</w:t>
+      </w:r>
+      <w:r>
+        <w:rPr/>
+        <w:t xml:space="preserve">. </w:t>
+      </w:r>
+      <w:r>
+        <w:rPr/>
+        <w:t>Final Summary</w:t>
+      </w:r>
+    </w:p>
+    <w:tbl>
+      <w:tblPr>
+        <w:tblW w:w="10080" w:type="dxa"/>
+        <w:jc w:val="left"/>
+        <w:tblInd w:w="0" w:type="dxa"/>
+        <w:tblLayout w:type="fixed"/>
+        <w:tblCellMar>
+          <w:top w:w="0" w:type="dxa"/>
+          <w:left w:w="0" w:type="dxa"/>
+          <w:bottom w:w="0" w:type="dxa"/>
+          <w:right w:w="0" w:type="dxa"/>
+        </w:tblCellMar>
+      </w:tblPr>
+      <w:tblGrid>
+        <w:gridCol w:w="2778"/>
+        <w:gridCol w:w="4061"/>
+        <w:gridCol w:w="1673"/>
+        <w:gridCol w:w="1568"/>
+      </w:tblGrid>
+      <w:tr>
+        <w:trPr>
+          <w:tblHeader w:val="true"/>
+        </w:trPr>
+        <w:tc>
+          <w:tcPr>
+            <w:tcW w:w="2778" w:type="dxa"/>
+            <w:tcBorders/>
+            <w:vAlign w:val="center"/>
+          </w:tcPr>
+          <w:p>
+            <w:pPr>
+              <w:pStyle w:val="TableHeading"/>
+              <w:spacing w:lineRule="auto" w:line="340" w:before="0" w:after="200"/>
+              <w:jc w:val="left"/>
+              <w:rPr>
+                <w:sz w:val="21"/>
+              </w:rPr>
+            </w:pPr>
+            <w:r>
+              <w:rPr>
+                <w:sz w:val="21"/>
+              </w:rPr>
+              <w:t>Model</w:t>
+            </w:r>
+          </w:p>
+        </w:tc>
+        <w:tc>
+          <w:tcPr>
+            <w:tcW w:w="4061" w:type="dxa"/>
+            <w:tcBorders/>
+            <w:vAlign w:val="center"/>
+          </w:tcPr>
+          <w:p>
+            <w:pPr>
+              <w:pStyle w:val="TableHeading"/>
+              <w:spacing w:lineRule="auto" w:line="340" w:before="0" w:after="200"/>
+              <w:jc w:val="left"/>
+              <w:rPr>
+                <w:sz w:val="21"/>
+              </w:rPr>
+            </w:pPr>
+            <w:r>
+              <w:rPr>
+                <w:sz w:val="21"/>
+              </w:rPr>
+              <w:t>Uses labels during pretraining?</w:t>
+            </w:r>
+          </w:p>
+        </w:tc>
+        <w:tc>
+          <w:tcPr>
+            <w:tcW w:w="1673" w:type="dxa"/>
+            <w:tcBorders/>
+            <w:vAlign w:val="center"/>
+          </w:tcPr>
+          <w:p>
+            <w:pPr>
+              <w:pStyle w:val="TableHeading"/>
+              <w:spacing w:lineRule="auto" w:line="340" w:before="0" w:after="200"/>
+              <w:jc w:val="left"/>
+              <w:rPr>
+                <w:sz w:val="21"/>
+              </w:rPr>
+            </w:pPr>
+            <w:r>
+              <w:rPr>
+                <w:sz w:val="21"/>
+              </w:rPr>
+              <w:t>Encoder frozen?</w:t>
+            </w:r>
+          </w:p>
+        </w:tc>
+        <w:tc>
+          <w:tcPr>
+            <w:tcW w:w="1568" w:type="dxa"/>
+            <w:tcBorders/>
+            <w:vAlign w:val="center"/>
+          </w:tcPr>
+          <w:p>
+            <w:pPr>
+              <w:pStyle w:val="TableHeading"/>
+              <w:spacing w:lineRule="auto" w:line="340" w:before="0" w:after="200"/>
+              <w:jc w:val="left"/>
+              <w:rPr>
+                <w:sz w:val="21"/>
+              </w:rPr>
+            </w:pPr>
+            <w:r>
+              <w:rPr>
+                <w:sz w:val="21"/>
+              </w:rPr>
+              <w:t>Test accuracy</w:t>
+            </w:r>
+          </w:p>
+        </w:tc>
+      </w:tr>
+      <w:tr>
+        <w:trPr/>
+        <w:tc>
+          <w:tcPr>
+            <w:tcW w:w="2778" w:type="dxa"/>
+            <w:tcBorders>
+              <w:bottom w:val="single" w:sz="2" w:space="0" w:color="000000"/>
+              <w:right w:val="single" w:sz="2" w:space="0" w:color="000000"/>
+            </w:tcBorders>
+            <w:tcMar>
+              <w:bottom w:w="75" w:type="dxa"/>
+              <w:right w:w="135" w:type="dxa"/>
+            </w:tcMar>
+            <w:vAlign w:val="center"/>
+          </w:tcPr>
+          <w:p>
+            <w:pPr>
+              <w:pStyle w:val="TableContents"/>
+              <w:spacing w:before="0" w:after="0"/>
+              <w:jc w:val="left"/>
+              <w:rPr/>
+            </w:pPr>
+            <w:r>
+              <w:rPr/>
+              <w:t>Supervised ResNet-18, 10% labels</w:t>
+            </w:r>
+          </w:p>
+        </w:tc>
+        <w:tc>
+          <w:tcPr>
+            <w:tcW w:w="4061" w:type="dxa"/>
+            <w:tcBorders>
+              <w:bottom w:val="single" w:sz="2" w:space="0" w:color="000000"/>
+              <w:right w:val="single" w:sz="2" w:space="0" w:color="000000"/>
+            </w:tcBorders>
+            <w:tcMar>
+              <w:bottom w:w="75" w:type="dxa"/>
+              <w:right w:w="135" w:type="dxa"/>
+            </w:tcMar>
+            <w:vAlign w:val="center"/>
+          </w:tcPr>
+          <w:p>
+            <w:pPr>
+              <w:pStyle w:val="TableContents"/>
+              <w:spacing w:before="0" w:after="0"/>
+              <w:jc w:val="left"/>
+              <w:rPr/>
+            </w:pPr>
+            <w:r>
+              <w:rPr/>
+              <w:t>Yes</w:t>
+            </w:r>
+          </w:p>
+        </w:tc>
+        <w:tc>
+          <w:tcPr>
+            <w:tcW w:w="1673" w:type="dxa"/>
+            <w:tcBorders>
+              <w:bottom w:val="single" w:sz="2" w:space="0" w:color="000000"/>
+              <w:right w:val="single" w:sz="2" w:space="0" w:color="000000"/>
+            </w:tcBorders>
+            <w:tcMar>
+              <w:bottom w:w="75" w:type="dxa"/>
+              <w:right w:w="135" w:type="dxa"/>
+            </w:tcMar>
+            <w:vAlign w:val="center"/>
+          </w:tcPr>
+          <w:p>
+            <w:pPr>
+              <w:pStyle w:val="TableContents"/>
+              <w:spacing w:before="0" w:after="0"/>
+              <w:jc w:val="left"/>
+              <w:rPr/>
+            </w:pPr>
+            <w:r>
+              <w:rPr/>
+              <w:t>No</w:t>
+            </w:r>
+          </w:p>
+        </w:tc>
+        <w:tc>
+          <w:tcPr>
+            <w:tcW w:w="1568" w:type="dxa"/>
+            <w:tcBorders>
+              <w:bottom w:val="single" w:sz="2" w:space="0" w:color="000000"/>
+            </w:tcBorders>
+            <w:tcMar>
+              <w:bottom w:w="75" w:type="dxa"/>
+            </w:tcMar>
+            <w:vAlign w:val="center"/>
+          </w:tcPr>
+          <w:p>
+            <w:pPr>
+              <w:pStyle w:val="TableContents"/>
+              <w:spacing w:before="0" w:after="0"/>
+              <w:jc w:val="left"/>
+              <w:rPr/>
+            </w:pPr>
+            <w:r>
+              <w:rPr/>
+              <w:t>69.56%</w:t>
+            </w:r>
+          </w:p>
+        </w:tc>
+      </w:tr>
+      <w:tr>
+        <w:trPr/>
+        <w:tc>
+          <w:tcPr>
+            <w:tcW w:w="2778" w:type="dxa"/>
+            <w:tcBorders>
+              <w:bottom w:val="single" w:sz="2" w:space="0" w:color="000000"/>
+              <w:right w:val="single" w:sz="2" w:space="0" w:color="000000"/>
+            </w:tcBorders>
+            <w:tcMar>
+              <w:bottom w:w="75" w:type="dxa"/>
+              <w:right w:w="135" w:type="dxa"/>
+            </w:tcMar>
+            <w:vAlign w:val="center"/>
+          </w:tcPr>
+          <w:p>
+            <w:pPr>
+              <w:pStyle w:val="TableContents"/>
+              <w:spacing w:before="0" w:after="0"/>
+              <w:jc w:val="left"/>
+              <w:rPr/>
+            </w:pPr>
+            <w:r>
+              <w:rPr/>
+              <w:t>Random encoder + linear probe</w:t>
+            </w:r>
+          </w:p>
+        </w:tc>
+        <w:tc>
+          <w:tcPr>
+            <w:tcW w:w="4061" w:type="dxa"/>
+            <w:tcBorders>
+              <w:bottom w:val="single" w:sz="2" w:space="0" w:color="000000"/>
+              <w:right w:val="single" w:sz="2" w:space="0" w:color="000000"/>
+            </w:tcBorders>
+            <w:tcMar>
+              <w:bottom w:w="75" w:type="dxa"/>
+              <w:right w:w="135" w:type="dxa"/>
+            </w:tcMar>
+            <w:vAlign w:val="center"/>
+          </w:tcPr>
+          <w:p>
+            <w:pPr>
+              <w:pStyle w:val="TableContents"/>
+              <w:spacing w:before="0" w:after="0"/>
+              <w:jc w:val="left"/>
+              <w:rPr/>
+            </w:pPr>
+            <w:r>
+              <w:rPr/>
+              <w:t>No</w:t>
+            </w:r>
+          </w:p>
+        </w:tc>
+        <w:tc>
+          <w:tcPr>
+            <w:tcW w:w="1673" w:type="dxa"/>
+            <w:tcBorders>
+              <w:bottom w:val="single" w:sz="2" w:space="0" w:color="000000"/>
+              <w:right w:val="single" w:sz="2" w:space="0" w:color="000000"/>
+            </w:tcBorders>
+            <w:tcMar>
+              <w:bottom w:w="75" w:type="dxa"/>
+              <w:right w:w="135" w:type="dxa"/>
+            </w:tcMar>
+            <w:vAlign w:val="center"/>
+          </w:tcPr>
+          <w:p>
+            <w:pPr>
+              <w:pStyle w:val="TableContents"/>
+              <w:spacing w:before="0" w:after="0"/>
+              <w:jc w:val="left"/>
+              <w:rPr/>
+            </w:pPr>
+            <w:r>
+              <w:rPr/>
+              <w:t>Yes</w:t>
+            </w:r>
+          </w:p>
+        </w:tc>
+        <w:tc>
+          <w:tcPr>
+            <w:tcW w:w="1568" w:type="dxa"/>
+            <w:tcBorders>
+              <w:bottom w:val="single" w:sz="2" w:space="0" w:color="000000"/>
+            </w:tcBorders>
+            <w:tcMar>
+              <w:bottom w:w="75" w:type="dxa"/>
+            </w:tcMar>
+            <w:vAlign w:val="center"/>
+          </w:tcPr>
+          <w:p>
+            <w:pPr>
+              <w:pStyle w:val="TableContents"/>
+              <w:spacing w:before="0" w:after="0"/>
+              <w:jc w:val="left"/>
+              <w:rPr/>
+            </w:pPr>
+            <w:r>
+              <w:rPr/>
+              <w:t>27.25%</w:t>
+            </w:r>
+          </w:p>
+        </w:tc>
+      </w:tr>
+      <w:tr>
+        <w:trPr/>
+        <w:tc>
+          <w:tcPr>
+            <w:tcW w:w="2778" w:type="dxa"/>
+            <w:tcBorders>
+              <w:bottom w:val="single" w:sz="2" w:space="0" w:color="000000"/>
+              <w:right w:val="single" w:sz="2" w:space="0" w:color="000000"/>
+            </w:tcBorders>
+            <w:tcMar>
+              <w:bottom w:w="75" w:type="dxa"/>
+              <w:right w:w="135" w:type="dxa"/>
+            </w:tcMar>
+            <w:vAlign w:val="center"/>
+          </w:tcPr>
+          <w:p>
+            <w:pPr>
+              <w:pStyle w:val="TableContents"/>
+              <w:spacing w:before="0" w:after="0"/>
+              <w:jc w:val="left"/>
+              <w:rPr/>
+            </w:pPr>
+            <w:r>
+              <w:rPr/>
+              <w:t>SimCLR encoder + linear probe</w:t>
+            </w:r>
+          </w:p>
+        </w:tc>
+        <w:tc>
+          <w:tcPr>
+            <w:tcW w:w="4061" w:type="dxa"/>
+            <w:tcBorders>
+              <w:bottom w:val="single" w:sz="2" w:space="0" w:color="000000"/>
+              <w:right w:val="single" w:sz="2" w:space="0" w:color="000000"/>
+            </w:tcBorders>
+            <w:tcMar>
+              <w:bottom w:w="75" w:type="dxa"/>
+              <w:right w:w="135" w:type="dxa"/>
+            </w:tcMar>
+            <w:vAlign w:val="center"/>
+          </w:tcPr>
+          <w:p>
+            <w:pPr>
+              <w:pStyle w:val="TableContents"/>
+              <w:spacing w:before="0" w:after="0"/>
+              <w:jc w:val="left"/>
+              <w:rPr/>
+            </w:pPr>
+            <w:r>
+              <w:rPr/>
+              <w:t>No</w:t>
+            </w:r>
+          </w:p>
+        </w:tc>
+        <w:tc>
+          <w:tcPr>
+            <w:tcW w:w="1673" w:type="dxa"/>
+            <w:tcBorders>
+              <w:bottom w:val="single" w:sz="2" w:space="0" w:color="000000"/>
+              <w:right w:val="single" w:sz="2" w:space="0" w:color="000000"/>
+            </w:tcBorders>
+            <w:tcMar>
+              <w:bottom w:w="75" w:type="dxa"/>
+              <w:right w:w="135" w:type="dxa"/>
+            </w:tcMar>
+            <w:vAlign w:val="center"/>
+          </w:tcPr>
+          <w:p>
+            <w:pPr>
+              <w:pStyle w:val="TableContents"/>
+              <w:spacing w:before="0" w:after="0"/>
+              <w:jc w:val="left"/>
+              <w:rPr/>
+            </w:pPr>
+            <w:r>
+              <w:rPr/>
+              <w:t>Yes</w:t>
+            </w:r>
+          </w:p>
+        </w:tc>
+        <w:tc>
+          <w:tcPr>
+            <w:tcW w:w="1568" w:type="dxa"/>
+            <w:tcBorders>
+              <w:bottom w:val="single" w:sz="2" w:space="0" w:color="000000"/>
+            </w:tcBorders>
+            <w:tcMar>
+              <w:bottom w:w="75" w:type="dxa"/>
+            </w:tcMar>
+            <w:vAlign w:val="center"/>
+          </w:tcPr>
+          <w:p>
+            <w:pPr>
+              <w:pStyle w:val="TableContents"/>
+              <w:spacing w:before="0" w:after="0"/>
+              <w:jc w:val="left"/>
+              <w:rPr/>
+            </w:pPr>
+            <w:r>
+              <w:rPr/>
+              <w:t>74.76%</w:t>
+            </w:r>
+          </w:p>
+        </w:tc>
+      </w:tr>
+      <w:tr>
+        <w:trPr/>
+        <w:tc>
+          <w:tcPr>
+            <w:tcW w:w="2778" w:type="dxa"/>
+            <w:tcBorders>
+              <w:right w:val="single" w:sz="2" w:space="0" w:color="000000"/>
+            </w:tcBorders>
+            <w:tcMar>
+              <w:right w:w="135" w:type="dxa"/>
+            </w:tcMar>
+            <w:vAlign w:val="center"/>
+          </w:tcPr>
+          <w:p>
+            <w:pPr>
+              <w:pStyle w:val="TableContents"/>
+              <w:spacing w:before="0" w:after="0"/>
+              <w:jc w:val="left"/>
+              <w:rPr/>
+            </w:pPr>
+            <w:r>
+              <w:rPr/>
+              <w:t>SimCLR encoder + fine-tuning</w:t>
+            </w:r>
+          </w:p>
+        </w:tc>
+        <w:tc>
+          <w:tcPr>
+            <w:tcW w:w="4061" w:type="dxa"/>
+            <w:tcBorders>
+              <w:right w:val="single" w:sz="2" w:space="0" w:color="000000"/>
+            </w:tcBorders>
+            <w:tcMar>
+              <w:right w:w="135" w:type="dxa"/>
+            </w:tcMar>
+            <w:vAlign w:val="center"/>
+          </w:tcPr>
+          <w:p>
+            <w:pPr>
+              <w:pStyle w:val="TableContents"/>
+              <w:spacing w:before="0" w:after="0"/>
+              <w:jc w:val="left"/>
+              <w:rPr/>
+            </w:pPr>
+            <w:r>
+              <w:rPr/>
+              <w:t>No during SimCLR pretrain; Yes during fine-tuning</w:t>
+            </w:r>
+          </w:p>
+        </w:tc>
+        <w:tc>
+          <w:tcPr>
+            <w:tcW w:w="1673" w:type="dxa"/>
+            <w:tcBorders>
+              <w:right w:val="single" w:sz="2" w:space="0" w:color="000000"/>
+            </w:tcBorders>
+            <w:tcMar>
+              <w:right w:w="135" w:type="dxa"/>
+            </w:tcMar>
+            <w:vAlign w:val="center"/>
+          </w:tcPr>
+          <w:p>
+            <w:pPr>
+              <w:pStyle w:val="TableContents"/>
+              <w:spacing w:before="0" w:after="0"/>
+              <w:jc w:val="left"/>
+              <w:rPr/>
+            </w:pPr>
+            <w:r>
+              <w:rPr/>
+              <w:t>No</w:t>
+            </w:r>
+          </w:p>
+        </w:tc>
+        <w:tc>
+          <w:tcPr>
+            <w:tcW w:w="1568" w:type="dxa"/>
+            <w:tcBorders/>
+            <w:vAlign w:val="center"/>
+          </w:tcPr>
+          <w:p>
+            <w:pPr>
+              <w:pStyle w:val="TableContents"/>
+              <w:spacing w:before="0" w:after="0"/>
+              <w:jc w:val="left"/>
+              <w:rPr/>
+            </w:pPr>
+            <w:r>
+              <w:rPr/>
+              <w:t>81.67%</w:t>
+            </w:r>
+          </w:p>
+        </w:tc>
+      </w:tr>
+    </w:tbl>
+    <w:p>
+      <w:pPr>
+        <w:pStyle w:val="TextBody"/>
+        <w:tabs>
+          <w:tab w:val="clear" w:pos="720"/>
+          <w:tab w:val="left" w:pos="0" w:leader="none"/>
+        </w:tabs>
+        <w:ind w:hanging="0"/>
+        <w:rPr/>
+      </w:pPr>
+      <w:r>
+        <w:rPr/>
       </w:r>
     </w:p>
     <w:p>

</xml_diff>